<commit_message>
Mean +/- SD spectra: light shadow over bands with a consistent EV-NV peak shift
Co-Authored-By: Claude Opus 5.5 <noreply@anthropic.com>
Claude-Session: https://claude.ai/code/session_01L8hQ8e5u5KmaH4dD9snyRw
</commit_message>
<xml_diff>
--- a/Acacia_MeanSD_Spectra_Code.docx
+++ b/Acacia_MeanSD_Spectra_Code.docx
@@ -47,7 +47,7 @@
         <w:spacing w:after="40"/>
       </w:pPr>
       <w:r>
-        <w:t>4. Run the file. Data are read from C:\Users\Hira Aman\Downloads\CODE 005 and the figure (Fig_MeanSD_400-1790.png / .tiff) and the peak table (MeanSD_400-1790_peaks.csv) are saved in CODE 005\RESULTS.</w:t>
+        <w:t>4. Run the file. Data are read from C:\Users\Hira Aman\Downloads\CODE 005 and the figure (Fig_MeanSD_400-1790.png / .tiff) the peak table (MeanSD_400-1790_peaks.csv) and the peak-shift table (MeanSD_400-1790_shifts.csv) are saved in CODE 005\RESULTS.</w:t>
       </w:r>
     </w:p>
     <w:p>
@@ -221,7 +221,20 @@
           <w:sz w:val="15"/>
           <w:noProof/>
         </w:rPr>
-        <w:t># to MeanSD_400-1790_peaks.csv.</w:t>
+        <w:t># to MeanSD_400-1790_peaks.csv. Grey shadows mark the bands whose peak shift</w:t>
+      </w:r>
+    </w:p>
+    <w:p>
+      <w:pPr>
+        <w:spacing w:before="0" w:after="0" w:line="240" w:lineRule="auto"/>
+      </w:pPr>
+      <w:r>
+        <w:rPr>
+          <w:rFonts w:ascii="Consolas" w:hAnsi="Consolas" w:eastAsia="Consolas" w:cs="Consolas"/>
+          <w:sz w:val="15"/>
+          <w:noProof/>
+        </w:rPr>
+        <w:t># between EVs and NVs is consistent across all sites (MeanSD_400-1790_shifts.csv).</w:t>
       </w:r>
     </w:p>
     <w:p>
@@ -632,6 +645,96 @@
           <w:sz w:val="15"/>
           <w:noProof/>
         </w:rPr>
+        <w:t># bands compared for a peak shift: (EV nominal, NV nominal). A light grey shadow is</w:t>
+      </w:r>
+    </w:p>
+    <w:p>
+      <w:pPr>
+        <w:spacing w:before="0" w:after="0" w:line="240" w:lineRule="auto"/>
+      </w:pPr>
+      <w:r>
+        <w:rPr>
+          <w:rFonts w:ascii="Consolas" w:hAnsi="Consolas" w:eastAsia="Consolas" w:cs="Consolas"/>
+          <w:sz w:val="15"/>
+          <w:noProof/>
+        </w:rPr>
+        <w:t># drawn over a band only when the shift is consistent: the six site-mean peak</w:t>
+      </w:r>
+    </w:p>
+    <w:p>
+      <w:pPr>
+        <w:spacing w:before="0" w:after="0" w:line="240" w:lineRule="auto"/>
+      </w:pPr>
+      <w:r>
+        <w:rPr>
+          <w:rFonts w:ascii="Consolas" w:hAnsi="Consolas" w:eastAsia="Consolas" w:cs="Consolas"/>
+          <w:sz w:val="15"/>
+          <w:noProof/>
+        </w:rPr>
+        <w:t># positions of EVs and of NVs do not overlap.</w:t>
+      </w:r>
+    </w:p>
+    <w:p>
+      <w:pPr>
+        <w:spacing w:before="0" w:after="0" w:line="240" w:lineRule="auto"/>
+      </w:pPr>
+      <w:r>
+        <w:rPr>
+          <w:rFonts w:ascii="Consolas" w:hAnsi="Consolas" w:eastAsia="Consolas" w:cs="Consolas"/>
+          <w:sz w:val="15"/>
+          <w:noProof/>
+        </w:rPr>
+        <w:t>SHIFT_PAIRS = [(519, 519), (809, 799), (931, 927), (1001, 1001), (1161, 1169),</w:t>
+      </w:r>
+    </w:p>
+    <w:p>
+      <w:pPr>
+        <w:spacing w:before="0" w:after="0" w:line="240" w:lineRule="auto"/>
+      </w:pPr>
+      <w:r>
+        <w:rPr>
+          <w:rFonts w:ascii="Consolas" w:hAnsi="Consolas" w:eastAsia="Consolas" w:cs="Consolas"/>
+          <w:sz w:val="15"/>
+          <w:noProof/>
+        </w:rPr>
+        <w:t xml:space="preserve">               (1249, 1245), (1373, 1385), (1603, 1607)]</w:t>
+      </w:r>
+    </w:p>
+    <w:p>
+      <w:pPr>
+        <w:spacing w:before="0" w:after="0" w:line="240" w:lineRule="auto"/>
+      </w:pPr>
+      <w:r>
+        <w:rPr>
+          <w:rFonts w:ascii="Consolas" w:hAnsi="Consolas" w:eastAsia="Consolas" w:cs="Consolas"/>
+          <w:sz w:val="15"/>
+          <w:noProof/>
+        </w:rPr>
+        <w:t>SHADOW_PAD = 4                             # cm-1 added on each side of the two peaks</w:t>
+      </w:r>
+    </w:p>
+    <w:p>
+      <w:pPr>
+        <w:spacing w:before="0" w:after="0" w:line="240" w:lineRule="auto"/>
+      </w:pPr>
+      <w:r>
+        <w:rPr>
+          <w:rFonts w:ascii="Consolas" w:hAnsi="Consolas" w:eastAsia="Consolas" w:cs="Consolas"/>
+          <w:sz w:val="15"/>
+          <w:noProof/>
+        </w:rPr>
+      </w:r>
+    </w:p>
+    <w:p>
+      <w:pPr>
+        <w:spacing w:before="0" w:after="0" w:line="240" w:lineRule="auto"/>
+      </w:pPr>
+      <w:r>
+        <w:rPr>
+          <w:rFonts w:ascii="Consolas" w:hAnsi="Consolas" w:eastAsia="Consolas" w:cs="Consolas"/>
+          <w:sz w:val="15"/>
+          <w:noProof/>
+        </w:rPr>
         <w:t># nominal band, class, assignment (CSV), placement ('up', 'up-left', 'up-right')</w:t>
       </w:r>
     </w:p>
@@ -1561,7 +1664,7 @@
           <w:sz w:val="15"/>
           <w:noProof/>
         </w:rPr>
-        <w:t xml:space="preserve">    out = []</w:t>
+        <w:t xml:space="preserve">    out, site_ids = [], []</w:t>
       </w:r>
     </w:p>
     <w:p>
@@ -1678,7 +1781,20 @@
           <w:sz w:val="15"/>
           <w:noProof/>
         </w:rPr>
-        <w:t xml:space="preserve">    return grid, np.array(out)</w:t>
+        <w:t xml:space="preserve">            site_ids.append(site)</w:t>
+      </w:r>
+    </w:p>
+    <w:p>
+      <w:pPr>
+        <w:spacing w:before="0" w:after="0" w:line="240" w:lineRule="auto"/>
+      </w:pPr>
+      <w:r>
+        <w:rPr>
+          <w:rFonts w:ascii="Consolas" w:hAnsi="Consolas" w:eastAsia="Consolas" w:cs="Consolas"/>
+          <w:sz w:val="15"/>
+          <w:noProof/>
+        </w:rPr>
+        <w:t xml:space="preserve">    return grid, np.array(out), np.array(site_ids)</w:t>
       </w:r>
     </w:p>
     <w:p>
@@ -2023,7 +2139,7 @@
           <w:sz w:val="15"/>
           <w:noProof/>
         </w:rPr>
-        <w:t>g, X_ev = load_snv(EV_FILE)</w:t>
+        <w:t>g, X_ev, s_ev = load_snv(EV_FILE)</w:t>
       </w:r>
     </w:p>
     <w:p>
@@ -2036,7 +2152,7 @@
           <w:sz w:val="15"/>
           <w:noProof/>
         </w:rPr>
-        <w:t>_, X_nv = load_snv(NV_FILE)</w:t>
+        <w:t>_, X_nv, s_nv = load_snv(NV_FILE)</w:t>
       </w:r>
     </w:p>
     <w:p>
@@ -2100,6 +2216,149 @@
           <w:sz w:val="15"/>
           <w:noProof/>
         </w:rPr>
+        <w:t>shifts = []</w:t>
+      </w:r>
+    </w:p>
+    <w:p>
+      <w:pPr>
+        <w:spacing w:before="0" w:after="0" w:line="240" w:lineRule="auto"/>
+      </w:pPr>
+      <w:r>
+        <w:rPr>
+          <w:rFonts w:ascii="Consolas" w:hAnsi="Consolas" w:eastAsia="Consolas" w:cs="Consolas"/>
+          <w:sz w:val="15"/>
+          <w:noProof/>
+        </w:rPr>
+        <w:t>for ev_nom, nv_nom in SHIFT_PAIRS:</w:t>
+      </w:r>
+    </w:p>
+    <w:p>
+      <w:pPr>
+        <w:spacing w:before="0" w:after="0" w:line="240" w:lineRule="auto"/>
+      </w:pPr>
+      <w:r>
+        <w:rPr>
+          <w:rFonts w:ascii="Consolas" w:hAnsi="Consolas" w:eastAsia="Consolas" w:cs="Consolas"/>
+          <w:sz w:val="15"/>
+          <w:noProof/>
+        </w:rPr>
+        <w:t xml:space="preserve">    pe = peak_position(g, X_ev.mean(0), ev_nom - 12, ev_nom + 12)</w:t>
+      </w:r>
+    </w:p>
+    <w:p>
+      <w:pPr>
+        <w:spacing w:before="0" w:after="0" w:line="240" w:lineRule="auto"/>
+      </w:pPr>
+      <w:r>
+        <w:rPr>
+          <w:rFonts w:ascii="Consolas" w:hAnsi="Consolas" w:eastAsia="Consolas" w:cs="Consolas"/>
+          <w:sz w:val="15"/>
+          <w:noProof/>
+        </w:rPr>
+        <w:t xml:space="preserve">    pn = peak_position(g, X_nv.mean(0), nv_nom - 12, nv_nom + 12)</w:t>
+      </w:r>
+    </w:p>
+    <w:p>
+      <w:pPr>
+        <w:spacing w:before="0" w:after="0" w:line="240" w:lineRule="auto"/>
+      </w:pPr>
+      <w:r>
+        <w:rPr>
+          <w:rFonts w:ascii="Consolas" w:hAnsi="Consolas" w:eastAsia="Consolas" w:cs="Consolas"/>
+          <w:sz w:val="15"/>
+          <w:noProof/>
+        </w:rPr>
+        <w:t xml:space="preserve">    se = [peak_position(g, X_ev[s_ev == k].mean(0), ev_nom - 12, ev_nom + 12) for k in SITES]</w:t>
+      </w:r>
+    </w:p>
+    <w:p>
+      <w:pPr>
+        <w:spacing w:before="0" w:after="0" w:line="240" w:lineRule="auto"/>
+      </w:pPr>
+      <w:r>
+        <w:rPr>
+          <w:rFonts w:ascii="Consolas" w:hAnsi="Consolas" w:eastAsia="Consolas" w:cs="Consolas"/>
+          <w:sz w:val="15"/>
+          <w:noProof/>
+        </w:rPr>
+        <w:t xml:space="preserve">    sn = [peak_position(g, X_nv[s_nv == k].mean(0), nv_nom - 12, nv_nom + 12) for k in SITES]</w:t>
+      </w:r>
+    </w:p>
+    <w:p>
+      <w:pPr>
+        <w:spacing w:before="0" w:after="0" w:line="240" w:lineRule="auto"/>
+      </w:pPr>
+      <w:r>
+        <w:rPr>
+          <w:rFonts w:ascii="Consolas" w:hAnsi="Consolas" w:eastAsia="Consolas" w:cs="Consolas"/>
+          <w:sz w:val="15"/>
+          <w:noProof/>
+        </w:rPr>
+        <w:t xml:space="preserve">    consistent = max(se) &lt; min(sn) or max(sn) &lt; min(se)</w:t>
+      </w:r>
+    </w:p>
+    <w:p>
+      <w:pPr>
+        <w:spacing w:before="0" w:after="0" w:line="240" w:lineRule="auto"/>
+      </w:pPr>
+      <w:r>
+        <w:rPr>
+          <w:rFonts w:ascii="Consolas" w:hAnsi="Consolas" w:eastAsia="Consolas" w:cs="Consolas"/>
+          <w:sz w:val="15"/>
+          <w:noProof/>
+        </w:rPr>
+        <w:t xml:space="preserve">    shifts.append([round(pe, 1), round(pn, 1), round(pn - pe, 1), consistent])</w:t>
+      </w:r>
+    </w:p>
+    <w:p>
+      <w:pPr>
+        <w:spacing w:before="0" w:after="0" w:line="240" w:lineRule="auto"/>
+      </w:pPr>
+      <w:r>
+        <w:rPr>
+          <w:rFonts w:ascii="Consolas" w:hAnsi="Consolas" w:eastAsia="Consolas" w:cs="Consolas"/>
+          <w:sz w:val="15"/>
+          <w:noProof/>
+        </w:rPr>
+        <w:t xml:space="preserve">    if consistent:                         # light shadow over the shifted band</w:t>
+      </w:r>
+    </w:p>
+    <w:p>
+      <w:pPr>
+        <w:spacing w:before="0" w:after="0" w:line="240" w:lineRule="auto"/>
+      </w:pPr>
+      <w:r>
+        <w:rPr>
+          <w:rFonts w:ascii="Consolas" w:hAnsi="Consolas" w:eastAsia="Consolas" w:cs="Consolas"/>
+          <w:sz w:val="15"/>
+          <w:noProof/>
+        </w:rPr>
+        <w:t xml:space="preserve">        ax.axvspan(min(pe, pn) - SHADOW_PAD, max(pe, pn) + SHADOW_PAD, color='0.92', lw=0,</w:t>
+      </w:r>
+    </w:p>
+    <w:p>
+      <w:pPr>
+        <w:spacing w:before="0" w:after="0" w:line="240" w:lineRule="auto"/>
+      </w:pPr>
+      <w:r>
+        <w:rPr>
+          <w:rFonts w:ascii="Consolas" w:hAnsi="Consolas" w:eastAsia="Consolas" w:cs="Consolas"/>
+          <w:sz w:val="15"/>
+          <w:noProof/>
+        </w:rPr>
+        <w:t xml:space="preserve">                   zorder=0)</w:t>
+      </w:r>
+    </w:p>
+    <w:p>
+      <w:pPr>
+        <w:spacing w:before="0" w:after="0" w:line="240" w:lineRule="auto"/>
+      </w:pPr>
+      <w:r>
+        <w:rPr>
+          <w:rFonts w:ascii="Consolas" w:hAnsi="Consolas" w:eastAsia="Consolas" w:cs="Consolas"/>
+          <w:sz w:val="15"/>
+          <w:noProof/>
+        </w:rPr>
         <w:t>rows, labels, lines = [], [], []</w:t>
       </w:r>
     </w:p>
@@ -2515,7 +2774,20 @@
           <w:sz w:val="15"/>
           <w:noProof/>
         </w:rPr>
-        <w:t>ax.legend(frameon=False, fontsize=10, loc='upper left', handlelength=1.5)</w:t>
+        <w:t>ax.legend(frameon=True, facecolor='white', edgecolor='none', framealpha=1, fontsize=10,</w:t>
+      </w:r>
+    </w:p>
+    <w:p>
+      <w:pPr>
+        <w:spacing w:before="0" w:after="0" w:line="240" w:lineRule="auto"/>
+      </w:pPr>
+      <w:r>
+        <w:rPr>
+          <w:rFonts w:ascii="Consolas" w:hAnsi="Consolas" w:eastAsia="Consolas" w:cs="Consolas"/>
+          <w:sz w:val="15"/>
+          <w:noProof/>
+        </w:rPr>
+        <w:t xml:space="preserve">          loc='upper left', handlelength=1.5)</w:t>
       </w:r>
     </w:p>
     <w:p>
@@ -2644,7 +2916,72 @@
           <w:sz w:val="15"/>
           <w:noProof/>
         </w:rPr>
-        <w:t>for r in rows:</w:t>
+        <w:t>with open(OUTPUT_DIR / 'MeanSD_400-1790_shifts.csv', 'w', newline='') as fh:</w:t>
+      </w:r>
+    </w:p>
+    <w:p>
+      <w:pPr>
+        <w:spacing w:before="0" w:after="0" w:line="240" w:lineRule="auto"/>
+      </w:pPr>
+      <w:r>
+        <w:rPr>
+          <w:rFonts w:ascii="Consolas" w:hAnsi="Consolas" w:eastAsia="Consolas" w:cs="Consolas"/>
+          <w:sz w:val="15"/>
+          <w:noProof/>
+        </w:rPr>
+        <w:t xml:space="preserve">    w = csv.writer(fh)</w:t>
+      </w:r>
+    </w:p>
+    <w:p>
+      <w:pPr>
+        <w:spacing w:before="0" w:after="0" w:line="240" w:lineRule="auto"/>
+      </w:pPr>
+      <w:r>
+        <w:rPr>
+          <w:rFonts w:ascii="Consolas" w:hAnsi="Consolas" w:eastAsia="Consolas" w:cs="Consolas"/>
+          <w:sz w:val="15"/>
+          <w:noProof/>
+        </w:rPr>
+        <w:t xml:space="preserve">    w.writerow(['EV peak (cm-1)', 'NV peak (cm-1)', 'Shift NV-EV (cm-1)',</w:t>
+      </w:r>
+    </w:p>
+    <w:p>
+      <w:pPr>
+        <w:spacing w:before="0" w:after="0" w:line="240" w:lineRule="auto"/>
+      </w:pPr>
+      <w:r>
+        <w:rPr>
+          <w:rFonts w:ascii="Consolas" w:hAnsi="Consolas" w:eastAsia="Consolas" w:cs="Consolas"/>
+          <w:sz w:val="15"/>
+          <w:noProof/>
+        </w:rPr>
+        <w:t xml:space="preserve">                'Consistent (site ranges separated, shadowed)'])</w:t>
+      </w:r>
+    </w:p>
+    <w:p>
+      <w:pPr>
+        <w:spacing w:before="0" w:after="0" w:line="240" w:lineRule="auto"/>
+      </w:pPr>
+      <w:r>
+        <w:rPr>
+          <w:rFonts w:ascii="Consolas" w:hAnsi="Consolas" w:eastAsia="Consolas" w:cs="Consolas"/>
+          <w:sz w:val="15"/>
+          <w:noProof/>
+        </w:rPr>
+        <w:t xml:space="preserve">    w.writerows(shifts)</w:t>
+      </w:r>
+    </w:p>
+    <w:p>
+      <w:pPr>
+        <w:spacing w:before="0" w:after="0" w:line="240" w:lineRule="auto"/>
+      </w:pPr>
+      <w:r>
+        <w:rPr>
+          <w:rFonts w:ascii="Consolas" w:hAnsi="Consolas" w:eastAsia="Consolas" w:cs="Consolas"/>
+          <w:sz w:val="15"/>
+          <w:noProof/>
+        </w:rPr>
+        <w:t>for r in rows + shifts:</w:t>
       </w:r>
     </w:p>
     <w:p>

</xml_diff>

<commit_message>
Mean +/- SD spectra: sample SD (n-1); independent check of SD and peak positions
Co-Authored-By: Claude Opus 5.5 <noreply@anthropic.com>
Claude-Session: https://claude.ai/code/session_01L8hQ8e5u5KmaH4dD9snyRw
</commit_message>
<xml_diff>
--- a/Acacia_MeanSD_Spectra_Code.docx
+++ b/Acacia_MeanSD_Spectra_Code.docx
@@ -47,7 +47,7 @@
         <w:spacing w:after="40"/>
       </w:pPr>
       <w:r>
-        <w:t>4. Run the file. Data are read from C:\Users\Hira Aman\Downloads\CODE 005 and the figure (Fig_MeanSD_400-1790.png / .tiff) the peak table (MeanSD_400-1790_peaks.csv) and the peak-shift table (MeanSD_400-1790_shifts.csv) are saved in CODE 005\RESULTS.</w:t>
+        <w:t>4. Run the file. Data are read from C:\Users\Hira Aman\Downloads\CODE 005 and the figure (Fig_MeanSD_400-1790.png / .tiff), the peak table (MeanSD_400-1790_peaks.csv) and the peak-shift table (MeanSD_400-1790_shifts.csv) are saved in CODE 005\RESULTS.</w:t>
       </w:r>
     </w:p>
     <w:p>
@@ -169,7 +169,20 @@
           <w:sz w:val="15"/>
           <w:noProof/>
         </w:rPr>
-        <w:t># Plotted: mean spectrum (line) +/- 1 standard deviation (shaded) of each group,</w:t>
+        <w:t># Plotted: mean spectrum (line) +/- 1 sample standard deviation (n - 1, shaded) of</w:t>
+      </w:r>
+    </w:p>
+    <w:p>
+      <w:pPr>
+        <w:spacing w:before="0" w:after="0" w:line="240" w:lineRule="auto"/>
+      </w:pPr>
+      <w:r>
+        <w:rPr>
+          <w:rFonts w:ascii="Consolas" w:hAnsi="Consolas" w:eastAsia="Consolas" w:cs="Consolas"/>
+          <w:sz w:val="15"/>
+          <w:noProof/>
+        </w:rPr>
+        <w:t># each group,</w:t>
       </w:r>
     </w:p>
     <w:p>
@@ -2398,7 +2411,7 @@
           <w:sz w:val="15"/>
           <w:noProof/>
         </w:rPr>
-        <w:t xml:space="preserve">    mu, sd = X.mean(0)[show], X.std(0)[show]</w:t>
+        <w:t xml:space="preserve">    mu, sd = X.mean(0)[show], X.std(0, ddof=1)[show]          # sample SD (n - 1)</w:t>
       </w:r>
     </w:p>
     <w:p>
@@ -2670,7 +2683,7 @@
           <w:sz w:val="15"/>
           <w:noProof/>
         </w:rPr>
-        <w:t>ax.set_ylim((X_ev.mean(0) - X_ev.std(0))[show].min() - 0.3,</w:t>
+        <w:t>ax.set_ylim((X_ev.mean(0) - X_ev.std(0, ddof=1))[show].min() - 0.3,</w:t>
       </w:r>
     </w:p>
     <w:p>
@@ -2683,7 +2696,7 @@
           <w:sz w:val="15"/>
           <w:noProof/>
         </w:rPr>
-        <w:t xml:space="preserve">            (X_nv.mean(0) + X_nv.std(0))[show].max() + OFFSET + 4.3)</w:t>
+        <w:t xml:space="preserve">            (X_nv.mean(0) + X_nv.std(0, ddof=1))[show].max() + OFFSET + 4.3)</w:t>
       </w:r>
     </w:p>
     <w:p>

</xml_diff>